<commit_message>
feat: Cesta mnoha věcí filter, kin talents and goods revision (1.8.6)
- Goods: dedicated Cesta mnoha věcí filter (ranks I-III, willpower cost),
  half-elf Duševní síla counts the first willpower point twice.
- Kin talents per the Czech Player's Guide, assigned automatically from
  the character's kin; new Rodové tab with a mismatch confirmation.
- Goods catalog revision against Průvodce hráče and internal consistency
  via self-retiring corrections in backend/goodsCorrections.js; synced
  the latest Zboží.docx from Google Drive.
- Attribute cards ordered Síla, Obratnost, Bystrost, Osobnost.
- Release 1.8.6 (versionCode 13) with FL_1.8.6.apk.

Co-Authored-By: Claude Opus 5.5 <noreply@anthropic.com>
</commit_message>
<xml_diff>
--- a/zz-denik/import_files/Zboží.docx
+++ b/zz-denik/import_files/Zboží.docx
@@ -6102,6 +6102,7 @@
               <w:jc w:val="center"/>
               <w:rPr>
                 <w:b w:val="1"/>
+                <w:bCs w:val="1"/>
                 <w:color w:val="000000"/>
                 <w:sz w:val="16"/>
                 <w:szCs w:val="16"/>
@@ -6110,6 +6111,7 @@
             <w:r>
               <w:rPr>
                 <w:b w:val="1"/>
+                <w:bCs w:val="1"/>
                 <w:color w:val="000000"/>
                 <w:sz w:val="16"/>
                 <w:szCs w:val="16"/>
@@ -6126,6 +6128,7 @@
               <w:jc w:val="center"/>
               <w:rPr>
                 <w:b w:val="1"/>
+                <w:bCs w:val="1"/>
                 <w:color w:val="000000"/>
                 <w:sz w:val="16"/>
                 <w:szCs w:val="16"/>
@@ -6134,6 +6137,7 @@
             <w:r>
               <w:rPr>
                 <w:b w:val="1"/>
+                <w:bCs w:val="1"/>
                 <w:color w:val="000000"/>
                 <w:sz w:val="16"/>
                 <w:szCs w:val="16"/>
@@ -6150,6 +6154,7 @@
               <w:jc w:val="center"/>
               <w:rPr>
                 <w:b w:val="1"/>
+                <w:bCs w:val="1"/>
                 <w:color w:val="000000"/>
                 <w:sz w:val="16"/>
                 <w:szCs w:val="16"/>
@@ -6158,6 +6163,7 @@
             <w:r>
               <w:rPr>
                 <w:b w:val="1"/>
+                <w:bCs w:val="1"/>
                 <w:color w:val="000000"/>
                 <w:sz w:val="16"/>
                 <w:szCs w:val="16"/>
@@ -6174,6 +6180,7 @@
               <w:jc w:val="center"/>
               <w:rPr>
                 <w:b w:val="1"/>
+                <w:bCs w:val="1"/>
                 <w:color w:val="000000"/>
                 <w:sz w:val="16"/>
                 <w:szCs w:val="16"/>
@@ -6182,6 +6189,7 @@
             <w:r>
               <w:rPr>
                 <w:b w:val="1"/>
+                <w:bCs w:val="1"/>
                 <w:color w:val="000000"/>
                 <w:sz w:val="16"/>
                 <w:szCs w:val="16"/>
@@ -6198,6 +6206,7 @@
               <w:jc w:val="center"/>
               <w:rPr>
                 <w:b w:val="1"/>
+                <w:bCs w:val="1"/>
                 <w:color w:val="000000"/>
                 <w:sz w:val="16"/>
                 <w:szCs w:val="16"/>
@@ -6206,6 +6215,7 @@
             <w:r>
               <w:rPr>
                 <w:b w:val="1"/>
+                <w:bCs w:val="1"/>
                 <w:color w:val="000000"/>
                 <w:sz w:val="16"/>
                 <w:szCs w:val="16"/>
@@ -6222,6 +6232,7 @@
               <w:jc w:val="center"/>
               <w:rPr>
                 <w:b w:val="1"/>
+                <w:bCs w:val="1"/>
                 <w:color w:val="000000"/>
                 <w:sz w:val="16"/>
                 <w:szCs w:val="16"/>
@@ -6230,6 +6241,7 @@
             <w:r>
               <w:rPr>
                 <w:b w:val="1"/>
+                <w:bCs w:val="1"/>
                 <w:color w:val="000000"/>
                 <w:sz w:val="16"/>
                 <w:szCs w:val="16"/>
@@ -6246,6 +6258,7 @@
               <w:jc w:val="center"/>
               <w:rPr>
                 <w:b w:val="1"/>
+                <w:bCs w:val="1"/>
                 <w:color w:val="000000"/>
                 <w:sz w:val="16"/>
                 <w:szCs w:val="16"/>
@@ -6254,6 +6267,7 @@
             <w:r>
               <w:rPr>
                 <w:b w:val="1"/>
+                <w:bCs w:val="1"/>
                 <w:color w:val="000000"/>
                 <w:sz w:val="16"/>
                 <w:szCs w:val="16"/>
@@ -6270,6 +6284,7 @@
               <w:jc w:val="center"/>
               <w:rPr>
                 <w:b w:val="1"/>
+                <w:bCs w:val="1"/>
                 <w:color w:val="000000"/>
                 <w:sz w:val="16"/>
                 <w:szCs w:val="16"/>
@@ -6278,6 +6293,7 @@
             <w:r>
               <w:rPr>
                 <w:b w:val="1"/>
+                <w:bCs w:val="1"/>
                 <w:color w:val="000000"/>
                 <w:sz w:val="16"/>
                 <w:szCs w:val="16"/>
@@ -14594,7 +14610,20 @@
                 <w:szCs w:val="20"/>
                 <w:rtl w:val="0"/>
               </w:rPr>
-              <w:t xml:space="preserve">sečná, zahnutá</w:t>
+              <w:t xml:space="preserve">sečná, zahnutá, těžk</w:t>
+            </w:r>
+            <w:r>
+              <w:rPr>
+                <w:sz w:val="20"/>
+                <w:szCs w:val="20"/>
+                <w:rtl w:val="0"/>
+              </w:rPr>
+              <w:t xml:space="preserve">á</w:t>
+            </w:r>
+            <w:r>
+              <w:rPr>
+                <w:rtl w:val="0"/>
+              </w:rPr>
             </w:r>
           </w:p>
         </w:tc>
@@ -19011,7 +19040,7 @@
                 <w:szCs w:val="20"/>
                 <w:rtl w:val="0"/>
               </w:rPr>
-              <w:t xml:space="preserve">+1</w:t>
+              <w:t xml:space="preserve">+2</w:t>
             </w:r>
           </w:p>
         </w:tc>
@@ -19246,7 +19275,7 @@
                 <w:szCs w:val="20"/>
                 <w:rtl w:val="0"/>
               </w:rPr>
-              <w:t xml:space="preserve">+1</w:t>
+              <w:t xml:space="preserve">+2</w:t>
             </w:r>
           </w:p>
         </w:tc>
@@ -20939,6 +20968,7 @@
             <w:r>
               <w:rPr>
                 <w:i w:val="1"/>
+                <w:iCs w:val="1"/>
                 <w:sz w:val="20"/>
                 <w:szCs w:val="20"/>
                 <w:rtl w:val="0"/>
@@ -20956,6 +20986,7 @@
             <w:r>
               <w:rPr>
                 <w:i w:val="1"/>
+                <w:iCs w:val="1"/>
                 <w:sz w:val="20"/>
                 <w:szCs w:val="20"/>
                 <w:rtl w:val="0"/>
@@ -20973,6 +21004,7 @@
             <w:r>
               <w:rPr>
                 <w:i w:val="1"/>
+                <w:iCs w:val="1"/>
                 <w:sz w:val="20"/>
                 <w:szCs w:val="20"/>
                 <w:rtl w:val="0"/>
@@ -20990,6 +21022,7 @@
             <w:r>
               <w:rPr>
                 <w:i w:val="1"/>
+                <w:iCs w:val="1"/>
                 <w:sz w:val="20"/>
                 <w:szCs w:val="20"/>
                 <w:rtl w:val="0"/>
@@ -24735,7 +24768,7 @@
               <w:rPr>
                 <w:rtl w:val="0"/>
               </w:rPr>
-              <w:t xml:space="preserve">lehké</w:t>
+              <w:t xml:space="preserve">normální</w:t>
             </w:r>
           </w:p>
         </w:tc>
@@ -31362,6 +31395,7 @@
             <w:r>
               <w:rPr>
                 <w:b w:val="0"/>
+                <w:bCs w:val="0"/>
                 <w:color w:val="000000"/>
                 <w:sz w:val="18"/>
                 <w:szCs w:val="18"/>
@@ -32820,6 +32854,7 @@
             <w:r>
               <w:rPr>
                 <w:b w:val="1"/>
+                <w:bCs w:val="1"/>
                 <w:sz w:val="18"/>
                 <w:szCs w:val="18"/>
                 <w:rtl w:val="0"/>
@@ -32842,6 +32877,7 @@
             <w:pPr>
               <w:rPr>
                 <w:b w:val="1"/>
+                <w:bCs w:val="1"/>
                 <w:sz w:val="18"/>
                 <w:szCs w:val="18"/>
               </w:rPr>
@@ -32857,6 +32893,7 @@
             <w:r>
               <w:rPr>
                 <w:b w:val="1"/>
+                <w:bCs w:val="1"/>
                 <w:sz w:val="18"/>
                 <w:szCs w:val="18"/>
                 <w:rtl w:val="0"/>
@@ -33381,6 +33418,7 @@
             <w:r>
               <w:rPr>
                 <w:b w:val="1"/>
+                <w:bCs w:val="1"/>
                 <w:sz w:val="18"/>
                 <w:szCs w:val="18"/>
                 <w:rtl w:val="0"/>
@@ -33403,6 +33441,7 @@
             <w:pPr>
               <w:rPr>
                 <w:b w:val="1"/>
+                <w:bCs w:val="1"/>
                 <w:sz w:val="18"/>
                 <w:szCs w:val="18"/>
               </w:rPr>
@@ -33418,6 +33457,7 @@
             <w:r>
               <w:rPr>
                 <w:b w:val="1"/>
+                <w:bCs w:val="1"/>
                 <w:sz w:val="18"/>
                 <w:szCs w:val="18"/>
                 <w:rtl w:val="0"/>
@@ -33608,6 +33648,7 @@
             <w:r>
               <w:rPr>
                 <w:b w:val="1"/>
+                <w:bCs w:val="1"/>
                 <w:sz w:val="18"/>
                 <w:szCs w:val="18"/>
                 <w:rtl w:val="0"/>
@@ -33648,6 +33689,7 @@
             <w:r>
               <w:rPr>
                 <w:b w:val="1"/>
+                <w:bCs w:val="1"/>
                 <w:sz w:val="18"/>
                 <w:szCs w:val="18"/>
                 <w:rtl w:val="0"/>
@@ -33851,6 +33893,7 @@
             <w:r>
               <w:rPr>
                 <w:b w:val="1"/>
+                <w:bCs w:val="1"/>
                 <w:sz w:val="18"/>
                 <w:szCs w:val="18"/>
                 <w:rtl w:val="0"/>
@@ -33891,6 +33934,7 @@
             <w:r>
               <w:rPr>
                 <w:b w:val="1"/>
+                <w:bCs w:val="1"/>
                 <w:sz w:val="18"/>
                 <w:szCs w:val="18"/>
                 <w:rtl w:val="0"/>
@@ -34094,6 +34138,7 @@
             <w:r>
               <w:rPr>
                 <w:b w:val="1"/>
+                <w:bCs w:val="1"/>
                 <w:sz w:val="18"/>
                 <w:szCs w:val="18"/>
                 <w:rtl w:val="0"/>
@@ -34120,6 +34165,7 @@
               <w:spacing w:line="276" w:lineRule="auto"/>
               <w:rPr>
                 <w:b w:val="1"/>
+                <w:bCs w:val="1"/>
                 <w:sz w:val="18"/>
                 <w:szCs w:val="18"/>
               </w:rPr>
@@ -34135,6 +34181,7 @@
             <w:r>
               <w:rPr>
                 <w:b w:val="1"/>
+                <w:bCs w:val="1"/>
                 <w:sz w:val="18"/>
                 <w:szCs w:val="18"/>
                 <w:rtl w:val="0"/>
@@ -34333,6 +34380,7 @@
             <w:r>
               <w:rPr>
                 <w:b w:val="1"/>
+                <w:bCs w:val="1"/>
                 <w:sz w:val="18"/>
                 <w:szCs w:val="18"/>
                 <w:rtl w:val="0"/>
@@ -34359,6 +34407,7 @@
               <w:spacing w:line="276" w:lineRule="auto"/>
               <w:rPr>
                 <w:b w:val="1"/>
+                <w:bCs w:val="1"/>
                 <w:sz w:val="18"/>
                 <w:szCs w:val="18"/>
               </w:rPr>
@@ -34374,6 +34423,7 @@
             <w:r>
               <w:rPr>
                 <w:b w:val="1"/>
+                <w:bCs w:val="1"/>
                 <w:sz w:val="18"/>
                 <w:szCs w:val="18"/>
                 <w:rtl w:val="0"/>
@@ -34570,6 +34620,7 @@
             <w:r>
               <w:rPr>
                 <w:b w:val="1"/>
+                <w:bCs w:val="1"/>
                 <w:sz w:val="18"/>
                 <w:szCs w:val="18"/>
                 <w:rtl w:val="0"/>
@@ -34596,6 +34647,7 @@
               <w:spacing w:line="276" w:lineRule="auto"/>
               <w:rPr>
                 <w:b w:val="1"/>
+                <w:bCs w:val="1"/>
                 <w:sz w:val="18"/>
                 <w:szCs w:val="18"/>
               </w:rPr>
@@ -34611,6 +34663,7 @@
             <w:r>
               <w:rPr>
                 <w:b w:val="1"/>
+                <w:bCs w:val="1"/>
                 <w:sz w:val="18"/>
                 <w:szCs w:val="18"/>
                 <w:rtl w:val="0"/>
@@ -34807,6 +34860,7 @@
             <w:r>
               <w:rPr>
                 <w:b w:val="1"/>
+                <w:bCs w:val="1"/>
                 <w:sz w:val="18"/>
                 <w:szCs w:val="18"/>
                 <w:rtl w:val="0"/>
@@ -35036,6 +35090,7 @@
             <w:r>
               <w:rPr>
                 <w:b w:val="1"/>
+                <w:bCs w:val="1"/>
                 <w:sz w:val="18"/>
                 <w:szCs w:val="18"/>
                 <w:rtl w:val="0"/>
@@ -35062,6 +35117,7 @@
               <w:spacing w:line="276" w:lineRule="auto"/>
               <w:rPr>
                 <w:b w:val="1"/>
+                <w:bCs w:val="1"/>
                 <w:sz w:val="18"/>
                 <w:szCs w:val="18"/>
               </w:rPr>
@@ -35077,6 +35133,7 @@
             <w:r>
               <w:rPr>
                 <w:b w:val="1"/>
+                <w:bCs w:val="1"/>
                 <w:sz w:val="18"/>
                 <w:szCs w:val="18"/>
                 <w:rtl w:val="0"/>
@@ -35275,6 +35332,7 @@
             <w:r>
               <w:rPr>
                 <w:b w:val="1"/>
+                <w:bCs w:val="1"/>
                 <w:sz w:val="18"/>
                 <w:szCs w:val="18"/>
                 <w:rtl w:val="0"/>
@@ -35301,6 +35359,7 @@
               <w:spacing w:line="276" w:lineRule="auto"/>
               <w:rPr>
                 <w:b w:val="1"/>
+                <w:bCs w:val="1"/>
                 <w:sz w:val="18"/>
                 <w:szCs w:val="18"/>
               </w:rPr>
@@ -35316,6 +35375,7 @@
             <w:r>
               <w:rPr>
                 <w:b w:val="1"/>
+                <w:bCs w:val="1"/>
                 <w:sz w:val="18"/>
                 <w:szCs w:val="18"/>
                 <w:rtl w:val="0"/>
@@ -35639,6 +35699,7 @@
             <w:r>
               <w:rPr>
                 <w:b w:val="1"/>
+                <w:bCs w:val="1"/>
                 <w:sz w:val="18"/>
                 <w:szCs w:val="18"/>
                 <w:rtl w:val="0"/>
@@ -35661,6 +35722,7 @@
             <w:pPr>
               <w:rPr>
                 <w:b w:val="1"/>
+                <w:bCs w:val="1"/>
                 <w:sz w:val="18"/>
                 <w:szCs w:val="18"/>
               </w:rPr>
@@ -35676,6 +35738,7 @@
             <w:r>
               <w:rPr>
                 <w:b w:val="1"/>
+                <w:bCs w:val="1"/>
                 <w:sz w:val="18"/>
                 <w:szCs w:val="18"/>
                 <w:rtl w:val="0"/>
@@ -35996,6 +36059,7 @@
             <w:r>
               <w:rPr>
                 <w:b w:val="1"/>
+                <w:bCs w:val="1"/>
                 <w:sz w:val="18"/>
                 <w:szCs w:val="18"/>
                 <w:rtl w:val="0"/>
@@ -36032,6 +36096,7 @@
             <w:r>
               <w:rPr>
                 <w:b w:val="1"/>
+                <w:bCs w:val="1"/>
                 <w:sz w:val="18"/>
                 <w:szCs w:val="18"/>
                 <w:rtl w:val="0"/>
@@ -36357,6 +36422,7 @@
             <w:r>
               <w:rPr>
                 <w:b w:val="1"/>
+                <w:bCs w:val="1"/>
                 <w:sz w:val="18"/>
                 <w:szCs w:val="18"/>
                 <w:rtl w:val="0"/>
@@ -36393,6 +36459,7 @@
             <w:r>
               <w:rPr>
                 <w:b w:val="1"/>
+                <w:bCs w:val="1"/>
                 <w:sz w:val="18"/>
                 <w:szCs w:val="18"/>
                 <w:rtl w:val="0"/>
@@ -36556,6 +36623,7 @@
             <w:r>
               <w:rPr>
                 <w:b w:val="1"/>
+                <w:bCs w:val="1"/>
                 <w:sz w:val="18"/>
                 <w:szCs w:val="18"/>
                 <w:rtl w:val="0"/>
@@ -36592,6 +36660,7 @@
             <w:r>
               <w:rPr>
                 <w:b w:val="1"/>
+                <w:bCs w:val="1"/>
                 <w:sz w:val="18"/>
                 <w:szCs w:val="18"/>
                 <w:rtl w:val="0"/>
@@ -36923,6 +36992,7 @@
             <w:r>
               <w:rPr>
                 <w:b w:val="1"/>
+                <w:bCs w:val="1"/>
                 <w:sz w:val="18"/>
                 <w:szCs w:val="18"/>
                 <w:rtl w:val="0"/>
@@ -36959,6 +37029,7 @@
             <w:r>
               <w:rPr>
                 <w:b w:val="1"/>
+                <w:bCs w:val="1"/>
                 <w:sz w:val="18"/>
                 <w:szCs w:val="18"/>
                 <w:rtl w:val="0"/>
@@ -37623,6 +37694,7 @@
             <w:r>
               <w:rPr>
                 <w:b w:val="1"/>
+                <w:bCs w:val="1"/>
                 <w:sz w:val="18"/>
                 <w:szCs w:val="18"/>
                 <w:rtl w:val="0"/>
@@ -37659,6 +37731,7 @@
             <w:r>
               <w:rPr>
                 <w:b w:val="1"/>
+                <w:bCs w:val="1"/>
                 <w:sz w:val="18"/>
                 <w:szCs w:val="18"/>
                 <w:rtl w:val="0"/>
@@ -37692,6 +37765,7 @@
             <w:r>
               <w:rPr>
                 <w:b w:val="1"/>
+                <w:bCs w:val="1"/>
                 <w:sz w:val="18"/>
                 <w:szCs w:val="18"/>
                 <w:rtl w:val="0"/>
@@ -38004,6 +38078,7 @@
             <w:r>
               <w:rPr>
                 <w:b w:val="1"/>
+                <w:bCs w:val="1"/>
                 <w:sz w:val="18"/>
                 <w:szCs w:val="18"/>
                 <w:rtl w:val="0"/>
@@ -38040,6 +38115,7 @@
             <w:r>
               <w:rPr>
                 <w:b w:val="1"/>
+                <w:bCs w:val="1"/>
                 <w:sz w:val="18"/>
                 <w:szCs w:val="18"/>
                 <w:rtl w:val="0"/>
@@ -38205,6 +38281,7 @@
             <w:r>
               <w:rPr>
                 <w:b w:val="1"/>
+                <w:bCs w:val="1"/>
                 <w:sz w:val="18"/>
                 <w:szCs w:val="18"/>
                 <w:rtl w:val="0"/>
@@ -38241,6 +38318,7 @@
             <w:r>
               <w:rPr>
                 <w:b w:val="1"/>
+                <w:bCs w:val="1"/>
                 <w:sz w:val="18"/>
                 <w:szCs w:val="18"/>
                 <w:rtl w:val="0"/>
@@ -38404,6 +38482,7 @@
             <w:r>
               <w:rPr>
                 <w:b w:val="1"/>
+                <w:bCs w:val="1"/>
                 <w:sz w:val="18"/>
                 <w:szCs w:val="18"/>
                 <w:rtl w:val="0"/>
@@ -38440,6 +38519,7 @@
             <w:r>
               <w:rPr>
                 <w:b w:val="1"/>
+                <w:bCs w:val="1"/>
                 <w:sz w:val="18"/>
                 <w:szCs w:val="18"/>
                 <w:rtl w:val="0"/>
@@ -38605,6 +38685,7 @@
             <w:r>
               <w:rPr>
                 <w:b w:val="1"/>
+                <w:bCs w:val="1"/>
                 <w:sz w:val="18"/>
                 <w:szCs w:val="18"/>
                 <w:rtl w:val="0"/>
@@ -38641,6 +38722,7 @@
             <w:r>
               <w:rPr>
                 <w:b w:val="1"/>
+                <w:bCs w:val="1"/>
                 <w:sz w:val="18"/>
                 <w:szCs w:val="18"/>
                 <w:rtl w:val="0"/>
@@ -38806,6 +38888,7 @@
             <w:r>
               <w:rPr>
                 <w:b w:val="1"/>
+                <w:bCs w:val="1"/>
                 <w:sz w:val="18"/>
                 <w:szCs w:val="18"/>
                 <w:rtl w:val="0"/>
@@ -38842,6 +38925,7 @@
             <w:r>
               <w:rPr>
                 <w:b w:val="1"/>
+                <w:bCs w:val="1"/>
                 <w:sz w:val="18"/>
                 <w:szCs w:val="18"/>
                 <w:rtl w:val="0"/>
@@ -39023,6 +39107,7 @@
             <w:r>
               <w:rPr>
                 <w:b w:val="1"/>
+                <w:bCs w:val="1"/>
                 <w:sz w:val="18"/>
                 <w:szCs w:val="18"/>
                 <w:rtl w:val="0"/>
@@ -39059,6 +39144,7 @@
             <w:r>
               <w:rPr>
                 <w:b w:val="1"/>
+                <w:bCs w:val="1"/>
                 <w:sz w:val="18"/>
                 <w:szCs w:val="18"/>
                 <w:rtl w:val="0"/>
@@ -39387,6 +39473,7 @@
             <w:r>
               <w:rPr>
                 <w:b w:val="1"/>
+                <w:bCs w:val="1"/>
                 <w:sz w:val="18"/>
                 <w:szCs w:val="18"/>
                 <w:rtl w:val="0"/>
@@ -39423,6 +39510,7 @@
             <w:r>
               <w:rPr>
                 <w:b w:val="1"/>
+                <w:bCs w:val="1"/>
                 <w:sz w:val="18"/>
                 <w:szCs w:val="18"/>
                 <w:rtl w:val="0"/>
@@ -40293,6 +40381,7 @@
             <w:r>
               <w:rPr>
                 <w:b w:val="1"/>
+                <w:bCs w:val="1"/>
                 <w:sz w:val="18"/>
                 <w:szCs w:val="18"/>
                 <w:rtl w:val="0"/>
@@ -42675,6 +42764,7 @@
             <w:r>
               <w:rPr>
                 <w:b w:val="1"/>
+                <w:bCs w:val="1"/>
                 <w:sz w:val="18"/>
                 <w:szCs w:val="18"/>
                 <w:rtl w:val="0"/>
@@ -43382,6 +43472,7 @@
         <w:pStyle w:val="Title"/>
         <w:rPr>
           <w:b w:val="1"/>
+          <w:bCs w:val="1"/>
           <w:sz w:val="48"/>
           <w:szCs w:val="48"/>
         </w:rPr>
@@ -43454,6 +43545,7 @@
             <w:r>
               <w:rPr>
                 <w:b w:val="1"/>
+                <w:bCs w:val="1"/>
                 <w:color w:val="212529"/>
                 <w:sz w:val="20"/>
                 <w:szCs w:val="20"/>
@@ -43494,6 +43586,7 @@
             <w:r>
               <w:rPr>
                 <w:b w:val="1"/>
+                <w:bCs w:val="1"/>
                 <w:color w:val="212529"/>
                 <w:sz w:val="20"/>
                 <w:szCs w:val="20"/>
@@ -43534,6 +43627,7 @@
             <w:r>
               <w:rPr>
                 <w:b w:val="1"/>
+                <w:bCs w:val="1"/>
                 <w:color w:val="212529"/>
                 <w:sz w:val="20"/>
                 <w:szCs w:val="20"/>
@@ -43574,6 +43668,7 @@
             <w:r>
               <w:rPr>
                 <w:b w:val="1"/>
+                <w:bCs w:val="1"/>
                 <w:color w:val="212529"/>
                 <w:sz w:val="20"/>
                 <w:szCs w:val="20"/>
@@ -43614,6 +43709,7 @@
             <w:r>
               <w:rPr>
                 <w:b w:val="1"/>
+                <w:bCs w:val="1"/>
                 <w:color w:val="212529"/>
                 <w:sz w:val="20"/>
                 <w:szCs w:val="20"/>
@@ -43662,6 +43758,7 @@
             <w:r>
               <w:rPr>
                 <w:b w:val="1"/>
+                <w:bCs w:val="1"/>
                 <w:color w:val="212529"/>
                 <w:sz w:val="20"/>
                 <w:szCs w:val="20"/>
@@ -43752,6 +43849,7 @@
             <w:r>
               <w:rPr>
                 <w:b w:val="1"/>
+                <w:bCs w:val="1"/>
                 <w:color w:val="212529"/>
                 <w:sz w:val="20"/>
                 <w:szCs w:val="20"/>
@@ -43802,6 +43900,7 @@
             <w:r>
               <w:rPr>
                 <w:b w:val="1"/>
+                <w:bCs w:val="1"/>
                 <w:color w:val="212529"/>
                 <w:sz w:val="20"/>
                 <w:szCs w:val="20"/>
@@ -43843,6 +43942,7 @@
             <w:r>
               <w:rPr>
                 <w:b w:val="1"/>
+                <w:bCs w:val="1"/>
                 <w:color w:val="212529"/>
                 <w:sz w:val="20"/>
                 <w:szCs w:val="20"/>
@@ -43862,6 +43962,7 @@
             <w:r>
               <w:rPr>
                 <w:b w:val="1"/>
+                <w:bCs w:val="1"/>
                 <w:color w:val="212529"/>
                 <w:sz w:val="20"/>
                 <w:szCs w:val="20"/>
@@ -43909,6 +44010,7 @@
             <w:r>
               <w:rPr>
                 <w:b w:val="1"/>
+                <w:bCs w:val="1"/>
                 <w:color w:val="212529"/>
                 <w:sz w:val="20"/>
                 <w:szCs w:val="20"/>
@@ -44027,6 +44129,7 @@
             <w:r>
               <w:rPr>
                 <w:b w:val="1"/>
+                <w:bCs w:val="1"/>
                 <w:color w:val="212529"/>
                 <w:sz w:val="20"/>
                 <w:szCs w:val="20"/>
@@ -44037,6 +44140,7 @@
             <w:r>
               <w:rPr>
                 <w:b w:val="1"/>
+                <w:bCs w:val="1"/>
                 <w:color w:val="212529"/>
                 <w:sz w:val="20"/>
                 <w:szCs w:val="20"/>
@@ -44078,6 +44182,7 @@
             <w:r>
               <w:rPr>
                 <w:b w:val="1"/>
+                <w:bCs w:val="1"/>
                 <w:color w:val="212529"/>
                 <w:sz w:val="20"/>
                 <w:szCs w:val="20"/>
@@ -44097,6 +44202,7 @@
             <w:r>
               <w:rPr>
                 <w:b w:val="1"/>
+                <w:bCs w:val="1"/>
                 <w:color w:val="212529"/>
                 <w:sz w:val="20"/>
                 <w:szCs w:val="20"/>
@@ -44145,6 +44251,7 @@
             <w:r>
               <w:rPr>
                 <w:b w:val="1"/>
+                <w:bCs w:val="1"/>
                 <w:color w:val="212529"/>
                 <w:sz w:val="20"/>
                 <w:szCs w:val="20"/>
@@ -44235,6 +44342,7 @@
             <w:r>
               <w:rPr>
                 <w:b w:val="1"/>
+                <w:bCs w:val="1"/>
                 <w:color w:val="212529"/>
                 <w:sz w:val="20"/>
                 <w:szCs w:val="20"/>
@@ -44285,6 +44393,7 @@
             <w:r>
               <w:rPr>
                 <w:b w:val="1"/>
+                <w:bCs w:val="1"/>
                 <w:color w:val="212529"/>
                 <w:sz w:val="20"/>
                 <w:szCs w:val="20"/>
@@ -44326,6 +44435,7 @@
             <w:r>
               <w:rPr>
                 <w:b w:val="1"/>
+                <w:bCs w:val="1"/>
                 <w:color w:val="212529"/>
                 <w:sz w:val="20"/>
                 <w:szCs w:val="20"/>
@@ -44345,6 +44455,7 @@
             <w:r>
               <w:rPr>
                 <w:b w:val="1"/>
+                <w:bCs w:val="1"/>
                 <w:color w:val="212529"/>
                 <w:sz w:val="20"/>
                 <w:szCs w:val="20"/>
@@ -44392,6 +44503,7 @@
             <w:r>
               <w:rPr>
                 <w:b w:val="1"/>
+                <w:bCs w:val="1"/>
                 <w:color w:val="212529"/>
                 <w:sz w:val="20"/>
                 <w:szCs w:val="20"/>
@@ -44471,6 +44583,7 @@
             <w:r>
               <w:rPr>
                 <w:b w:val="1"/>
+                <w:bCs w:val="1"/>
                 <w:color w:val="212529"/>
                 <w:sz w:val="20"/>
                 <w:szCs w:val="20"/>
@@ -44520,6 +44633,7 @@
             <w:r>
               <w:rPr>
                 <w:b w:val="1"/>
+                <w:bCs w:val="1"/>
                 <w:color w:val="212529"/>
                 <w:sz w:val="20"/>
                 <w:szCs w:val="20"/>
@@ -44560,6 +44674,7 @@
             <w:r>
               <w:rPr>
                 <w:b w:val="1"/>
+                <w:bCs w:val="1"/>
                 <w:color w:val="212529"/>
                 <w:sz w:val="20"/>
                 <w:szCs w:val="20"/>
@@ -44579,6 +44694,7 @@
             <w:r>
               <w:rPr>
                 <w:b w:val="1"/>
+                <w:bCs w:val="1"/>
                 <w:color w:val="212529"/>
                 <w:sz w:val="20"/>
                 <w:szCs w:val="20"/>
@@ -44627,6 +44743,7 @@
             <w:r>
               <w:rPr>
                 <w:b w:val="1"/>
+                <w:bCs w:val="1"/>
                 <w:color w:val="212529"/>
                 <w:sz w:val="20"/>
                 <w:szCs w:val="20"/>
@@ -44748,6 +44865,7 @@
             <w:r>
               <w:rPr>
                 <w:b w:val="1"/>
+                <w:bCs w:val="1"/>
                 <w:color w:val="212529"/>
                 <w:sz w:val="20"/>
                 <w:szCs w:val="20"/>
@@ -44835,6 +44953,7 @@
             <w:r>
               <w:rPr>
                 <w:b w:val="1"/>
+                <w:bCs w:val="1"/>
                 <w:color w:val="212529"/>
                 <w:sz w:val="20"/>
                 <w:szCs w:val="20"/>
@@ -44923,6 +45042,7 @@
             <w:r>
               <w:rPr>
                 <w:b w:val="1"/>
+                <w:bCs w:val="1"/>
                 <w:color w:val="212529"/>
                 <w:sz w:val="20"/>
                 <w:szCs w:val="20"/>
@@ -44972,6 +45092,7 @@
             <w:r>
               <w:rPr>
                 <w:b w:val="1"/>
+                <w:bCs w:val="1"/>
                 <w:color w:val="212529"/>
                 <w:sz w:val="20"/>
                 <w:szCs w:val="20"/>
@@ -45021,6 +45142,7 @@
             <w:r>
               <w:rPr>
                 <w:b w:val="1"/>
+                <w:bCs w:val="1"/>
                 <w:color w:val="212529"/>
                 <w:sz w:val="20"/>
                 <w:szCs w:val="20"/>
@@ -45069,6 +45191,7 @@
             <w:r>
               <w:rPr>
                 <w:b w:val="1"/>
+                <w:bCs w:val="1"/>
                 <w:color w:val="212529"/>
                 <w:sz w:val="20"/>
                 <w:szCs w:val="20"/>
@@ -45159,6 +45282,7 @@
             <w:r>
               <w:rPr>
                 <w:b w:val="1"/>
+                <w:bCs w:val="1"/>
                 <w:color w:val="212529"/>
                 <w:sz w:val="20"/>
                 <w:szCs w:val="20"/>
@@ -45200,6 +45324,7 @@
             <w:r>
               <w:rPr>
                 <w:b w:val="1"/>
+                <w:bCs w:val="1"/>
                 <w:color w:val="212529"/>
                 <w:sz w:val="20"/>
                 <w:szCs w:val="20"/>
@@ -45250,6 +45375,7 @@
             <w:r>
               <w:rPr>
                 <w:b w:val="1"/>
+                <w:bCs w:val="1"/>
                 <w:color w:val="212529"/>
                 <w:sz w:val="20"/>
                 <w:szCs w:val="20"/>
@@ -45297,6 +45423,7 @@
             <w:r>
               <w:rPr>
                 <w:b w:val="1"/>
+                <w:bCs w:val="1"/>
                 <w:color w:val="212529"/>
                 <w:sz w:val="20"/>
                 <w:szCs w:val="20"/>
@@ -45415,6 +45542,7 @@
             <w:r>
               <w:rPr>
                 <w:b w:val="1"/>
+                <w:bCs w:val="1"/>
                 <w:color w:val="212529"/>
                 <w:sz w:val="20"/>
                 <w:szCs w:val="20"/>
@@ -45464,6 +45592,7 @@
             <w:r>
               <w:rPr>
                 <w:b w:val="1"/>
+                <w:bCs w:val="1"/>
                 <w:color w:val="212529"/>
                 <w:sz w:val="20"/>
                 <w:szCs w:val="20"/>
@@ -45512,6 +45641,7 @@
             <w:r>
               <w:rPr>
                 <w:b w:val="1"/>
+                <w:bCs w:val="1"/>
                 <w:color w:val="212529"/>
                 <w:sz w:val="20"/>
                 <w:szCs w:val="20"/>
@@ -45602,6 +45732,7 @@
             <w:r>
               <w:rPr>
                 <w:b w:val="1"/>
+                <w:bCs w:val="1"/>
                 <w:color w:val="212529"/>
                 <w:sz w:val="20"/>
                 <w:szCs w:val="20"/>
@@ -45652,6 +45783,7 @@
             <w:r>
               <w:rPr>
                 <w:b w:val="1"/>
+                <w:bCs w:val="1"/>
                 <w:color w:val="212529"/>
                 <w:sz w:val="20"/>
                 <w:szCs w:val="20"/>
@@ -45702,6 +45834,7 @@
             <w:r>
               <w:rPr>
                 <w:b w:val="1"/>
+                <w:bCs w:val="1"/>
                 <w:color w:val="212529"/>
                 <w:sz w:val="20"/>
                 <w:szCs w:val="20"/>
@@ -45749,6 +45882,7 @@
             <w:r>
               <w:rPr>
                 <w:b w:val="1"/>
+                <w:bCs w:val="1"/>
                 <w:color w:val="212529"/>
                 <w:sz w:val="20"/>
                 <w:szCs w:val="20"/>
@@ -45828,6 +45962,7 @@
             <w:r>
               <w:rPr>
                 <w:b w:val="1"/>
+                <w:bCs w:val="1"/>
                 <w:color w:val="212529"/>
                 <w:sz w:val="20"/>
                 <w:szCs w:val="20"/>
@@ -45877,6 +46012,7 @@
             <w:r>
               <w:rPr>
                 <w:b w:val="1"/>
+                <w:bCs w:val="1"/>
                 <w:color w:val="212529"/>
                 <w:sz w:val="20"/>
                 <w:szCs w:val="20"/>
@@ -45964,6 +46100,7 @@
             <w:r>
               <w:rPr>
                 <w:b w:val="1"/>
+                <w:bCs w:val="1"/>
                 <w:color w:val="212529"/>
                 <w:sz w:val="20"/>
                 <w:szCs w:val="20"/>
@@ -46054,6 +46191,7 @@
             <w:r>
               <w:rPr>
                 <w:b w:val="1"/>
+                <w:bCs w:val="1"/>
                 <w:color w:val="212529"/>
                 <w:sz w:val="20"/>
                 <w:szCs w:val="20"/>
@@ -46073,6 +46211,7 @@
             <w:r>
               <w:rPr>
                 <w:b w:val="1"/>
+                <w:bCs w:val="1"/>
                 <w:color w:val="212529"/>
                 <w:sz w:val="20"/>
                 <w:szCs w:val="20"/>
@@ -46114,6 +46253,7 @@
             <w:r>
               <w:rPr>
                 <w:b w:val="1"/>
+                <w:bCs w:val="1"/>
                 <w:color w:val="212529"/>
                 <w:sz w:val="20"/>
                 <w:szCs w:val="20"/>
@@ -46201,6 +46341,7 @@
             <w:r>
               <w:rPr>
                 <w:b w:val="1"/>
+                <w:bCs w:val="1"/>
                 <w:color w:val="212529"/>
                 <w:sz w:val="20"/>
                 <w:szCs w:val="20"/>
@@ -46289,6 +46430,7 @@
             <w:r>
               <w:rPr>
                 <w:b w:val="1"/>
+                <w:bCs w:val="1"/>
                 <w:color w:val="212529"/>
                 <w:sz w:val="20"/>
                 <w:szCs w:val="20"/>
@@ -46329,6 +46471,7 @@
             <w:r>
               <w:rPr>
                 <w:b w:val="1"/>
+                <w:bCs w:val="1"/>
                 <w:color w:val="212529"/>
                 <w:sz w:val="20"/>
                 <w:szCs w:val="20"/>
@@ -46378,6 +46521,7 @@
             <w:r>
               <w:rPr>
                 <w:b w:val="1"/>
+                <w:bCs w:val="1"/>
                 <w:color w:val="212529"/>
                 <w:sz w:val="20"/>
                 <w:szCs w:val="20"/>
@@ -46426,6 +46570,7 @@
             <w:r>
               <w:rPr>
                 <w:b w:val="1"/>
+                <w:bCs w:val="1"/>
                 <w:color w:val="212529"/>
                 <w:sz w:val="20"/>
                 <w:szCs w:val="20"/>
@@ -46547,6 +46692,7 @@
             <w:r>
               <w:rPr>
                 <w:b w:val="1"/>
+                <w:bCs w:val="1"/>
                 <w:color w:val="212529"/>
                 <w:sz w:val="20"/>
                 <w:szCs w:val="20"/>
@@ -46558,6 +46704,7 @@
             <w:r>
               <w:rPr>
                 <w:b w:val="1"/>
+                <w:bCs w:val="1"/>
                 <w:color w:val="212529"/>
                 <w:sz w:val="20"/>
                 <w:szCs w:val="20"/>
@@ -46608,6 +46755,7 @@
             <w:r>
               <w:rPr>
                 <w:b w:val="1"/>
+                <w:bCs w:val="1"/>
                 <w:color w:val="212529"/>
                 <w:sz w:val="20"/>
                 <w:szCs w:val="20"/>
@@ -46655,6 +46803,7 @@
             <w:r>
               <w:rPr>
                 <w:b w:val="1"/>
+                <w:bCs w:val="1"/>
                 <w:color w:val="212529"/>
                 <w:sz w:val="20"/>
                 <w:szCs w:val="20"/>
@@ -46743,6 +46892,7 @@
             <w:r>
               <w:rPr>
                 <w:b w:val="1"/>
+                <w:bCs w:val="1"/>
                 <w:color w:val="212529"/>
                 <w:sz w:val="20"/>
                 <w:szCs w:val="20"/>
@@ -46783,6 +46933,7 @@
             <w:r>
               <w:rPr>
                 <w:b w:val="1"/>
+                <w:bCs w:val="1"/>
                 <w:color w:val="212529"/>
                 <w:sz w:val="20"/>
                 <w:szCs w:val="20"/>
@@ -46832,6 +46983,7 @@
             <w:r>
               <w:rPr>
                 <w:b w:val="1"/>
+                <w:bCs w:val="1"/>
                 <w:color w:val="212529"/>
                 <w:sz w:val="20"/>
                 <w:szCs w:val="20"/>
@@ -46880,6 +47032,7 @@
             <w:r>
               <w:rPr>
                 <w:b w:val="1"/>
+                <w:bCs w:val="1"/>
                 <w:color w:val="212529"/>
                 <w:sz w:val="20"/>
                 <w:szCs w:val="20"/>
@@ -47001,6 +47154,7 @@
             <w:r>
               <w:rPr>
                 <w:b w:val="1"/>
+                <w:bCs w:val="1"/>
                 <w:color w:val="212529"/>
                 <w:sz w:val="20"/>
                 <w:szCs w:val="20"/>
@@ -47051,6 +47205,7 @@
             <w:r>
               <w:rPr>
                 <w:b w:val="1"/>
+                <w:bCs w:val="1"/>
                 <w:color w:val="212529"/>
                 <w:sz w:val="20"/>
                 <w:szCs w:val="20"/>
@@ -47098,6 +47253,7 @@
             <w:r>
               <w:rPr>
                 <w:b w:val="1"/>
+                <w:bCs w:val="1"/>
                 <w:color w:val="212529"/>
                 <w:sz w:val="20"/>
                 <w:szCs w:val="20"/>
@@ -47177,6 +47333,7 @@
             <w:r>
               <w:rPr>
                 <w:b w:val="1"/>
+                <w:bCs w:val="1"/>
                 <w:color w:val="212529"/>
                 <w:sz w:val="20"/>
                 <w:szCs w:val="20"/>
@@ -47226,6 +47383,7 @@
             <w:r>
               <w:rPr>
                 <w:b w:val="1"/>
+                <w:bCs w:val="1"/>
                 <w:color w:val="212529"/>
                 <w:sz w:val="20"/>
                 <w:szCs w:val="20"/>
@@ -47313,6 +47471,7 @@
             <w:r>
               <w:rPr>
                 <w:b w:val="1"/>
+                <w:bCs w:val="1"/>
                 <w:color w:val="212529"/>
                 <w:sz w:val="20"/>
                 <w:szCs w:val="20"/>
@@ -47403,6 +47562,7 @@
             <w:r>
               <w:rPr>
                 <w:b w:val="1"/>
+                <w:bCs w:val="1"/>
                 <w:color w:val="212529"/>
                 <w:sz w:val="20"/>
                 <w:szCs w:val="20"/>
@@ -47453,6 +47613,7 @@
             <w:r>
               <w:rPr>
                 <w:b w:val="1"/>
+                <w:bCs w:val="1"/>
                 <w:color w:val="212529"/>
                 <w:sz w:val="20"/>
                 <w:szCs w:val="20"/>
@@ -47503,6 +47664,7 @@
             <w:r>
               <w:rPr>
                 <w:b w:val="1"/>
+                <w:bCs w:val="1"/>
                 <w:color w:val="212529"/>
                 <w:sz w:val="20"/>
                 <w:szCs w:val="20"/>
@@ -47559,6 +47721,7 @@
             <w:r>
               <w:rPr>
                 <w:b w:val="1"/>
+                <w:bCs w:val="1"/>
                 <w:color w:val="212529"/>
                 <w:sz w:val="20"/>
                 <w:szCs w:val="20"/>
@@ -47647,6 +47810,7 @@
             <w:r>
               <w:rPr>
                 <w:b w:val="1"/>
+                <w:bCs w:val="1"/>
                 <w:color w:val="212529"/>
                 <w:sz w:val="20"/>
                 <w:szCs w:val="20"/>
@@ -47687,6 +47851,7 @@
             <w:r>
               <w:rPr>
                 <w:b w:val="1"/>
+                <w:bCs w:val="1"/>
                 <w:color w:val="212529"/>
                 <w:sz w:val="20"/>
                 <w:szCs w:val="20"/>
@@ -47736,6 +47901,7 @@
             <w:r>
               <w:rPr>
                 <w:b w:val="1"/>
+                <w:bCs w:val="1"/>
                 <w:color w:val="212529"/>
                 <w:sz w:val="20"/>
                 <w:szCs w:val="20"/>
@@ -47793,6 +47959,7 @@
             <w:r>
               <w:rPr>
                 <w:b w:val="1"/>
+                <w:bCs w:val="1"/>
                 <w:color w:val="212529"/>
                 <w:sz w:val="20"/>
                 <w:szCs w:val="20"/>
@@ -47914,6 +48081,7 @@
             <w:r>
               <w:rPr>
                 <w:b w:val="1"/>
+                <w:bCs w:val="1"/>
                 <w:color w:val="212529"/>
                 <w:sz w:val="20"/>
                 <w:szCs w:val="20"/>
@@ -47964,6 +48132,7 @@
             <w:r>
               <w:rPr>
                 <w:b w:val="1"/>
+                <w:bCs w:val="1"/>
                 <w:color w:val="212529"/>
                 <w:sz w:val="20"/>
                 <w:szCs w:val="20"/>
@@ -48020,6 +48189,7 @@
             <w:r>
               <w:rPr>
                 <w:b w:val="1"/>
+                <w:bCs w:val="1"/>
                 <w:color w:val="212529"/>
                 <w:sz w:val="20"/>
                 <w:szCs w:val="20"/>
@@ -48108,6 +48278,7 @@
             <w:r>
               <w:rPr>
                 <w:b w:val="1"/>
+                <w:bCs w:val="1"/>
                 <w:color w:val="212529"/>
                 <w:sz w:val="20"/>
                 <w:szCs w:val="20"/>
@@ -48148,6 +48319,7 @@
             <w:r>
               <w:rPr>
                 <w:b w:val="1"/>
+                <w:bCs w:val="1"/>
                 <w:color w:val="212529"/>
                 <w:sz w:val="20"/>
                 <w:szCs w:val="20"/>
@@ -48197,6 +48369,7 @@
             <w:r>
               <w:rPr>
                 <w:b w:val="1"/>
+                <w:bCs w:val="1"/>
                 <w:color w:val="212529"/>
                 <w:sz w:val="20"/>
                 <w:szCs w:val="20"/>
@@ -48254,6 +48427,7 @@
             <w:r>
               <w:rPr>
                 <w:b w:val="1"/>
+                <w:bCs w:val="1"/>
                 <w:color w:val="212529"/>
                 <w:sz w:val="20"/>
                 <w:szCs w:val="20"/>
@@ -48375,6 +48549,7 @@
             <w:r>
               <w:rPr>
                 <w:b w:val="1"/>
+                <w:bCs w:val="1"/>
                 <w:color w:val="212529"/>
                 <w:sz w:val="20"/>
                 <w:szCs w:val="20"/>
@@ -48425,6 +48600,7 @@
             <w:r>
               <w:rPr>
                 <w:b w:val="1"/>
+                <w:bCs w:val="1"/>
                 <w:color w:val="212529"/>
                 <w:sz w:val="20"/>
                 <w:szCs w:val="20"/>
@@ -49097,6 +49273,7 @@
             <w:pPr>
               <w:rPr>
                 <w:b w:val="1"/>
+                <w:bCs w:val="1"/>
                 <w:color w:val="000000"/>
                 <w:u w:val="single"/>
               </w:rPr>
@@ -49104,6 +49281,7 @@
             <w:r>
               <w:rPr>
                 <w:b w:val="1"/>
+                <w:bCs w:val="1"/>
                 <w:color w:val="000000"/>
                 <w:u w:val="single"/>
                 <w:rtl w:val="0"/>
@@ -49174,6 +49352,7 @@
             <w:pPr>
               <w:rPr>
                 <w:b w:val="1"/>
+                <w:bCs w:val="1"/>
                 <w:color w:val="000000"/>
                 <w:u w:val="single"/>
               </w:rPr>
@@ -49181,6 +49360,7 @@
             <w:r>
               <w:rPr>
                 <w:b w:val="1"/>
+                <w:bCs w:val="1"/>
                 <w:color w:val="000000"/>
                 <w:u w:val="single"/>
                 <w:rtl w:val="0"/>
@@ -49311,6 +49491,7 @@
             <w:pPr>
               <w:rPr>
                 <w:b w:val="1"/>
+                <w:bCs w:val="1"/>
                 <w:color w:val="000000"/>
                 <w:u w:val="single"/>
               </w:rPr>
@@ -49318,6 +49499,7 @@
             <w:r>
               <w:rPr>
                 <w:b w:val="1"/>
+                <w:bCs w:val="1"/>
                 <w:color w:val="000000"/>
                 <w:u w:val="single"/>
                 <w:rtl w:val="0"/>
@@ -49540,6 +49722,7 @@
             <w:pPr>
               <w:rPr>
                 <w:b w:val="1"/>
+                <w:bCs w:val="1"/>
                 <w:color w:val="000000"/>
                 <w:u w:val="single"/>
               </w:rPr>
@@ -49547,6 +49730,7 @@
             <w:r>
               <w:rPr>
                 <w:b w:val="1"/>
+                <w:bCs w:val="1"/>
                 <w:color w:val="000000"/>
                 <w:u w:val="single"/>
                 <w:rtl w:val="0"/>
@@ -49654,11 +49838,19 @@
       </w:pPr>
     </w:pPrDefault>
   </w:docDefaults>
+  <w:style w:type="table" w:styleId="TableNormal" w:default="1">
+    <w:name w:val="TableNormal"/>
+    <w:tblPr>
+      <w:tblCellMar>
+        <w:top w:w="100.0" w:type="dxa"/>
+        <w:left w:w="100.0" w:type="dxa"/>
+        <w:bottom w:w="100.0" w:type="dxa"/>
+        <w:right w:w="100.0" w:type="dxa"/>
+      </w:tblCellMar>
+    </w:tblPr>
+  </w:style>
   <w:style w:type="paragraph" w:styleId="Normal" w:default="1">
     <w:name w:val="normal"/>
-  </w:style>
-  <w:style w:type="table" w:styleId="TableNormal" w:default="1">
-    <w:name w:val="Table Normal"/>
   </w:style>
   <w:style w:type="paragraph" w:styleId="Heading1">
     <w:name w:val="heading 1"/>
@@ -49670,6 +49862,7 @@
     <w:rPr>
       <w:rFonts w:ascii="Times New Roman" w:cs="Times New Roman" w:eastAsia="Times New Roman" w:hAnsi="Times New Roman"/>
       <w:b w:val="1"/>
+      <w:bCs w:val="1"/>
       <w:sz w:val="48"/>
       <w:szCs w:val="48"/>
     </w:rPr>
@@ -49685,6 +49878,7 @@
     </w:pPr>
     <w:rPr>
       <w:b w:val="1"/>
+      <w:bCs w:val="1"/>
       <w:sz w:val="36"/>
       <w:szCs w:val="36"/>
     </w:rPr>
@@ -49700,6 +49894,7 @@
     </w:pPr>
     <w:rPr>
       <w:b w:val="1"/>
+      <w:bCs w:val="1"/>
       <w:sz w:val="28"/>
       <w:szCs w:val="28"/>
     </w:rPr>
@@ -49715,6 +49910,7 @@
     </w:pPr>
     <w:rPr>
       <w:b w:val="1"/>
+      <w:bCs w:val="1"/>
       <w:sz w:val="24"/>
       <w:szCs w:val="24"/>
     </w:rPr>
@@ -49730,6 +49926,7 @@
     </w:pPr>
     <w:rPr>
       <w:b w:val="1"/>
+      <w:bCs w:val="1"/>
     </w:rPr>
   </w:style>
   <w:style w:type="paragraph" w:styleId="Heading6">
@@ -49743,6 +49940,7 @@
     </w:pPr>
     <w:rPr>
       <w:b w:val="1"/>
+      <w:bCs w:val="1"/>
       <w:sz w:val="20"/>
       <w:szCs w:val="20"/>
     </w:rPr>
@@ -50728,6 +50926,7 @@
     <w:rPr>
       <w:rFonts w:ascii="Georgia" w:cs="Georgia" w:eastAsia="Georgia" w:hAnsi="Georgia"/>
       <w:i w:val="1"/>
+      <w:iCs w:val="1"/>
       <w:color w:val="666666"/>
       <w:sz w:val="48"/>
       <w:szCs w:val="48"/>
@@ -50761,21 +50960,25 @@
     <w:tblStylePr w:type="firstCol">
       <w:rPr>
         <w:b w:val="1"/>
+        <w:bCs w:val="1"/>
       </w:rPr>
     </w:tblStylePr>
     <w:tblStylePr w:type="firstRow">
       <w:rPr>
         <w:b w:val="1"/>
+        <w:bCs w:val="1"/>
       </w:rPr>
     </w:tblStylePr>
     <w:tblStylePr w:type="lastCol">
       <w:rPr>
         <w:b w:val="1"/>
+        <w:bCs w:val="1"/>
       </w:rPr>
     </w:tblStylePr>
     <w:tblStylePr w:type="lastRow">
       <w:rPr>
         <w:b w:val="1"/>
+        <w:bCs w:val="1"/>
       </w:rPr>
       <w:tcPr>
         <w:tcBorders>
@@ -50812,21 +51015,25 @@
     <w:tblStylePr w:type="firstCol">
       <w:rPr>
         <w:b w:val="1"/>
+        <w:bCs w:val="1"/>
       </w:rPr>
     </w:tblStylePr>
     <w:tblStylePr w:type="firstRow">
       <w:rPr>
         <w:b w:val="1"/>
+        <w:bCs w:val="1"/>
       </w:rPr>
     </w:tblStylePr>
     <w:tblStylePr w:type="lastCol">
       <w:rPr>
         <w:b w:val="1"/>
+        <w:bCs w:val="1"/>
       </w:rPr>
     </w:tblStylePr>
     <w:tblStylePr w:type="lastRow">
       <w:rPr>
         <w:b w:val="1"/>
+        <w:bCs w:val="1"/>
       </w:rPr>
       <w:tcPr>
         <w:tcBorders>
@@ -50863,21 +51070,25 @@
     <w:tblStylePr w:type="firstCol">
       <w:rPr>
         <w:b w:val="1"/>
+        <w:bCs w:val="1"/>
       </w:rPr>
     </w:tblStylePr>
     <w:tblStylePr w:type="firstRow">
       <w:rPr>
         <w:b w:val="1"/>
+        <w:bCs w:val="1"/>
       </w:rPr>
     </w:tblStylePr>
     <w:tblStylePr w:type="lastCol">
       <w:rPr>
         <w:b w:val="1"/>
+        <w:bCs w:val="1"/>
       </w:rPr>
     </w:tblStylePr>
     <w:tblStylePr w:type="lastRow">
       <w:rPr>
         <w:b w:val="1"/>
+        <w:bCs w:val="1"/>
       </w:rPr>
       <w:tcPr>
         <w:tcBorders>
@@ -50914,21 +51125,25 @@
     <w:tblStylePr w:type="firstCol">
       <w:rPr>
         <w:b w:val="1"/>
+        <w:bCs w:val="1"/>
       </w:rPr>
     </w:tblStylePr>
     <w:tblStylePr w:type="firstRow">
       <w:rPr>
         <w:b w:val="1"/>
+        <w:bCs w:val="1"/>
       </w:rPr>
     </w:tblStylePr>
     <w:tblStylePr w:type="lastCol">
       <w:rPr>
         <w:b w:val="1"/>
+        <w:bCs w:val="1"/>
       </w:rPr>
     </w:tblStylePr>
     <w:tblStylePr w:type="lastRow">
       <w:rPr>
         <w:b w:val="1"/>
+        <w:bCs w:val="1"/>
       </w:rPr>
       <w:tcPr>
         <w:tcBorders>
@@ -50965,21 +51180,25 @@
     <w:tblStylePr w:type="firstCol">
       <w:rPr>
         <w:b w:val="1"/>
+        <w:bCs w:val="1"/>
       </w:rPr>
     </w:tblStylePr>
     <w:tblStylePr w:type="firstRow">
       <w:rPr>
         <w:b w:val="1"/>
+        <w:bCs w:val="1"/>
       </w:rPr>
     </w:tblStylePr>
     <w:tblStylePr w:type="lastCol">
       <w:rPr>
         <w:b w:val="1"/>
+        <w:bCs w:val="1"/>
       </w:rPr>
     </w:tblStylePr>
     <w:tblStylePr w:type="lastRow">
       <w:rPr>
         <w:b w:val="1"/>
+        <w:bCs w:val="1"/>
       </w:rPr>
       <w:tcPr>
         <w:tcBorders>
@@ -51016,21 +51235,25 @@
     <w:tblStylePr w:type="firstCol">
       <w:rPr>
         <w:b w:val="1"/>
+        <w:bCs w:val="1"/>
       </w:rPr>
     </w:tblStylePr>
     <w:tblStylePr w:type="firstRow">
       <w:rPr>
         <w:b w:val="1"/>
+        <w:bCs w:val="1"/>
       </w:rPr>
     </w:tblStylePr>
     <w:tblStylePr w:type="lastCol">
       <w:rPr>
         <w:b w:val="1"/>
+        <w:bCs w:val="1"/>
       </w:rPr>
     </w:tblStylePr>
     <w:tblStylePr w:type="lastRow">
       <w:rPr>
         <w:b w:val="1"/>
+        <w:bCs w:val="1"/>
       </w:rPr>
       <w:tcPr>
         <w:tcBorders>
@@ -51067,21 +51290,25 @@
     <w:tblStylePr w:type="firstCol">
       <w:rPr>
         <w:b w:val="1"/>
+        <w:bCs w:val="1"/>
       </w:rPr>
     </w:tblStylePr>
     <w:tblStylePr w:type="firstRow">
       <w:rPr>
         <w:b w:val="1"/>
+        <w:bCs w:val="1"/>
       </w:rPr>
     </w:tblStylePr>
     <w:tblStylePr w:type="lastCol">
       <w:rPr>
         <w:b w:val="1"/>
+        <w:bCs w:val="1"/>
       </w:rPr>
     </w:tblStylePr>
     <w:tblStylePr w:type="lastRow">
       <w:rPr>
         <w:b w:val="1"/>
+        <w:bCs w:val="1"/>
       </w:rPr>
       <w:tcPr>
         <w:tcBorders>
@@ -51131,21 +51358,25 @@
     <w:tblStylePr w:type="firstCol">
       <w:rPr>
         <w:b w:val="1"/>
+        <w:bCs w:val="1"/>
       </w:rPr>
     </w:tblStylePr>
     <w:tblStylePr w:type="firstRow">
       <w:rPr>
         <w:b w:val="1"/>
+        <w:bCs w:val="1"/>
       </w:rPr>
     </w:tblStylePr>
     <w:tblStylePr w:type="lastCol">
       <w:rPr>
         <w:b w:val="1"/>
+        <w:bCs w:val="1"/>
       </w:rPr>
     </w:tblStylePr>
     <w:tblStylePr w:type="lastRow">
       <w:rPr>
         <w:b w:val="1"/>
+        <w:bCs w:val="1"/>
       </w:rPr>
       <w:tcPr>
         <w:tcBorders>

</xml_diff>